<commit_message>
Archive HO-Cap perception evidence and retract lost local results
</commit_message>
<xml_diff>
--- a/paper/research_proposal_real2sim2real.docx
+++ b/paper/research_proposal_real2sim2real.docx
@@ -144,7 +144,7 @@
         <w:t>1. Capture and independent evaluation.</w:t>
       </w:r>
       <w:r>
-        <w:t xml:space="preserve"> Use existing ViKi recordings of a human moving a blue cube from a red support to a green goal. Check synchronization, calibration, frame loss, reconstructed geometry, and episode-level processing yield. Adapt a small subset of a public multiview RGB-D benchmark, initially DexYCB [3], into the pipeline's input format. Keep its provided hand and object annotations out of inference and use them only for evaluation. Report benchmark errors separately from self-consistency measurements on the local camera rig. A public grasping dataset cannot by itself validate a complete cube-transfer task or the two Kinect controllers.</w:t>
+        <w:t xml:space="preserve"> Collect and retain new ViKi recordings of a human moving a blue cube from a red support to a green goal. Check synchronization, calibration, frame loss, reconstructed geometry, and episode-level processing yield. Adapt a small subset of a public multiview RGB-D benchmark, initially DexYCB [3], into the pipeline's input format. Keep its provided hand and object annotations out of inference and use them only for evaluation. Report benchmark errors separately from self-consistency measurements on the local camera rig. A public grasping dataset cannot by itself validate a complete cube-transfer task or the two Kinect controllers.</w:t>
       </w:r>
     </w:p>
     <w:p>
@@ -196,7 +196,7 @@
     <w:p>
       <w:pPr/>
       <w:r>
-        <w:t xml:space="preserve">ViKi already has an offline path from synchronized RGB-D recordings through hand reconstruction and robot retargeting to trajectory artifacts. A cube-transfer pilot has reached this artifact stage. This does </w:t>
+        <w:t xml:space="preserve">ViKi implements offline capture, reconstruction and robot-retargeting stages, but the earlier local cube-transfer recordings and derived artifacts are no longer available to verify. New source episodes and calibration are required before reporting end-to-end outcomes. This does </w:t>
       </w:r>
       <w:r>
         <w:rPr>
@@ -205,13 +205,13 @@
         <w:t>not</w:t>
       </w:r>
       <w:r>
-        <w:t xml:space="preserve"> yet demonstrate a physically successful simulated grasp, a trained cube-transfer policy, or transfer to a real robot. Public-benchmark import, independent pose evaluation, a MuJoCo task, and policy experiments are planned work. The public repository demonstrates that implementation is underway, not that these planned results have been achieved.</w:t>
+        <w:t xml:space="preserve"> yet demonstrate a physically successful simulated grasp, a trained cube-transfer policy, or transfer to a real robot. A separate HO-Cap perception evaluation has retained numerical artifacts; new local capture, simulator validation, and policy experiments remain necessary for the proposed end-to-end study. The public repository demonstrates that implementation is underway, not that these planned results have been achieved.</w:t>
       </w:r>
     </w:p>
     <w:p>
       <w:pPr/>
       <w:r>
-        <w:t>The project can be evaluated with the existing cameras, recorded episodes, public benchmark annotations, and a modest simulation experiment. No motion-capture system or physical UR10 is required for the proposed proof of concept. Without a physical-robot experiment, the result will be described as a human-demonstration-to-simulation learning study, not as a completed Real-to-Sim-to-Real transfer.</w:t>
+        <w:t>The project can be evaluated with the existing cameras, newly recorded episodes, public benchmark annotations, and a modest simulation experiment. No motion-capture system or physical UR10 is required for the proposed proof of concept. Without a physical-robot experiment, the result will be described as a human-demonstration-to-simulation learning study, not as a completed Real-to-Sim-to-Real transfer.</w:t>
       </w:r>
     </w:p>
     <w:p>
@@ -225,7 +225,7 @@
     <w:p>
       <w:pPr/>
       <w:r>
-        <w:t>First, audit the existing recordings and select representative episodes before large-scale processing. In parallel, import a small public benchmark subset and check that coordinate frames and annotations are comparable. Next, establish a physically plausible MuJoCo cube-transfer scene and measure how often the current geometric plans succeed or fail when executed. Finally, train and evaluate the small policy comparison on held-out placements. If a stage fails, the analysis will report that limitation rather than silently treating a geometric or simulated artifact as a verified robot demonstration.</w:t>
+        <w:t>First, record and preserve a new local cohort with its calibration and select representative episodes before large-scale processing. In parallel, import a small public benchmark subset and check that coordinate frames and annotations are comparable. Next, establish a physically plausible MuJoCo cube-transfer scene and measure how often regenerated geometric plans succeed or fail when executed. Finally, train and evaluate the small policy comparison on held-out placements. If a stage fails, the analysis will report that limitation rather than silently treating a geometric or simulated artifact as a verified robot demonstration.</w:t>
       </w:r>
     </w:p>
     <w:p>

</xml_diff>